<commit_message>
Seite für die Ausleihen erstellt + Erstellungsformular
</commit_message>
<xml_diff>
--- a/Dokumente/Zwischenstand2/Dokumentation_Zwischenstand2_Reiter.docx
+++ b/Dokumente/Zwischenstand2/Dokumentation_Zwischenstand2_Reiter.docx
@@ -80,12 +80,84 @@
           <w:r>
             <w:fldChar w:fldCharType="separate"/>
           </w:r>
-          <w:hyperlink w:anchor="_Toc185186641" w:history="1">
+          <w:hyperlink w:anchor="_Toc185187709" w:history="1">
             <w:r>
               <w:rPr>
                 <w:rStyle w:val="Hyperlink"/>
                 <w:noProof/>
               </w:rPr>
+              <w:t>Vorwort</w:t>
+            </w:r>
+            <w:r>
+              <w:rPr>
+                <w:noProof/>
+                <w:webHidden/>
+              </w:rPr>
+              <w:tab/>
+            </w:r>
+            <w:r>
+              <w:rPr>
+                <w:noProof/>
+                <w:webHidden/>
+              </w:rPr>
+              <w:fldChar w:fldCharType="begin"/>
+            </w:r>
+            <w:r>
+              <w:rPr>
+                <w:noProof/>
+                <w:webHidden/>
+              </w:rPr>
+              <w:instrText xml:space="preserve"> PAGEREF _Toc185187709 \h </w:instrText>
+            </w:r>
+            <w:r>
+              <w:rPr>
+                <w:noProof/>
+                <w:webHidden/>
+              </w:rPr>
+            </w:r>
+            <w:r>
+              <w:rPr>
+                <w:noProof/>
+                <w:webHidden/>
+              </w:rPr>
+              <w:fldChar w:fldCharType="separate"/>
+            </w:r>
+            <w:r>
+              <w:rPr>
+                <w:noProof/>
+                <w:webHidden/>
+              </w:rPr>
+              <w:t>2</w:t>
+            </w:r>
+            <w:r>
+              <w:rPr>
+                <w:noProof/>
+                <w:webHidden/>
+              </w:rPr>
+              <w:fldChar w:fldCharType="end"/>
+            </w:r>
+          </w:hyperlink>
+        </w:p>
+        <w:p>
+          <w:pPr>
+            <w:pStyle w:val="Verzeichnis1"/>
+            <w:tabs>
+              <w:tab w:val="right" w:leader="dot" w:pos="9062"/>
+            </w:tabs>
+            <w:rPr>
+              <w:rFonts w:eastAsiaTheme="minorEastAsia"/>
+              <w:noProof/>
+              <w:sz w:val="24"/>
+              <w:szCs w:val="24"/>
+              <w:lang w:eastAsia="de-AT"/>
+            </w:rPr>
+          </w:pPr>
+          <w:hyperlink w:anchor="_Toc185187710" w:history="1">
+            <w:r>
+              <w:rPr>
+                <w:rStyle w:val="Hyperlink"/>
+                <w:noProof/>
+              </w:rPr>
               <w:t>Startseite</w:t>
             </w:r>
             <w:r>
@@ -107,7 +179,7 @@
                 <w:noProof/>
                 <w:webHidden/>
               </w:rPr>
-              <w:instrText xml:space="preserve"> PAGEREF _Toc185186641 \h </w:instrText>
+              <w:instrText xml:space="preserve"> PAGEREF _Toc185187710 \h </w:instrText>
             </w:r>
             <w:r>
               <w:rPr>
@@ -152,7 +224,7 @@
               <w:lang w:eastAsia="de-AT"/>
             </w:rPr>
           </w:pPr>
-          <w:hyperlink w:anchor="_Toc185186642" w:history="1">
+          <w:hyperlink w:anchor="_Toc185187711" w:history="1">
             <w:r>
               <w:rPr>
                 <w:rStyle w:val="Hyperlink"/>
@@ -179,7 +251,7 @@
                 <w:noProof/>
                 <w:webHidden/>
               </w:rPr>
-              <w:instrText xml:space="preserve"> PAGEREF _Toc185186642 \h </w:instrText>
+              <w:instrText xml:space="preserve"> PAGEREF _Toc185187711 \h </w:instrText>
             </w:r>
             <w:r>
               <w:rPr>
@@ -224,7 +296,7 @@
               <w:lang w:eastAsia="de-AT"/>
             </w:rPr>
           </w:pPr>
-          <w:hyperlink w:anchor="_Toc185186643" w:history="1">
+          <w:hyperlink w:anchor="_Toc185187712" w:history="1">
             <w:r>
               <w:rPr>
                 <w:rStyle w:val="Hyperlink"/>
@@ -251,7 +323,7 @@
                 <w:noProof/>
                 <w:webHidden/>
               </w:rPr>
-              <w:instrText xml:space="preserve"> PAGEREF _Toc185186643 \h </w:instrText>
+              <w:instrText xml:space="preserve"> PAGEREF _Toc185187712 \h </w:instrText>
             </w:r>
             <w:r>
               <w:rPr>
@@ -271,7 +343,295 @@
                 <w:noProof/>
                 <w:webHidden/>
               </w:rPr>
-              <w:t>2</w:t>
+              <w:t>3</w:t>
+            </w:r>
+            <w:r>
+              <w:rPr>
+                <w:noProof/>
+                <w:webHidden/>
+              </w:rPr>
+              <w:fldChar w:fldCharType="end"/>
+            </w:r>
+          </w:hyperlink>
+        </w:p>
+        <w:p>
+          <w:pPr>
+            <w:pStyle w:val="Verzeichnis3"/>
+            <w:tabs>
+              <w:tab w:val="right" w:leader="dot" w:pos="9062"/>
+            </w:tabs>
+            <w:rPr>
+              <w:rFonts w:eastAsiaTheme="minorEastAsia"/>
+              <w:noProof/>
+              <w:sz w:val="24"/>
+              <w:szCs w:val="24"/>
+              <w:lang w:eastAsia="de-AT"/>
+            </w:rPr>
+          </w:pPr>
+          <w:hyperlink w:anchor="_Toc185187713" w:history="1">
+            <w:r>
+              <w:rPr>
+                <w:rStyle w:val="Hyperlink"/>
+                <w:noProof/>
+              </w:rPr>
+              <w:t>GuestController.php</w:t>
+            </w:r>
+            <w:r>
+              <w:rPr>
+                <w:noProof/>
+                <w:webHidden/>
+              </w:rPr>
+              <w:tab/>
+            </w:r>
+            <w:r>
+              <w:rPr>
+                <w:noProof/>
+                <w:webHidden/>
+              </w:rPr>
+              <w:fldChar w:fldCharType="begin"/>
+            </w:r>
+            <w:r>
+              <w:rPr>
+                <w:noProof/>
+                <w:webHidden/>
+              </w:rPr>
+              <w:instrText xml:space="preserve"> PAGEREF _Toc185187713 \h </w:instrText>
+            </w:r>
+            <w:r>
+              <w:rPr>
+                <w:noProof/>
+                <w:webHidden/>
+              </w:rPr>
+            </w:r>
+            <w:r>
+              <w:rPr>
+                <w:noProof/>
+                <w:webHidden/>
+              </w:rPr>
+              <w:fldChar w:fldCharType="separate"/>
+            </w:r>
+            <w:r>
+              <w:rPr>
+                <w:noProof/>
+                <w:webHidden/>
+              </w:rPr>
+              <w:t>3</w:t>
+            </w:r>
+            <w:r>
+              <w:rPr>
+                <w:noProof/>
+                <w:webHidden/>
+              </w:rPr>
+              <w:fldChar w:fldCharType="end"/>
+            </w:r>
+          </w:hyperlink>
+        </w:p>
+        <w:p>
+          <w:pPr>
+            <w:pStyle w:val="Verzeichnis3"/>
+            <w:tabs>
+              <w:tab w:val="right" w:leader="dot" w:pos="9062"/>
+            </w:tabs>
+            <w:rPr>
+              <w:rFonts w:eastAsiaTheme="minorEastAsia"/>
+              <w:noProof/>
+              <w:sz w:val="24"/>
+              <w:szCs w:val="24"/>
+              <w:lang w:eastAsia="de-AT"/>
+            </w:rPr>
+          </w:pPr>
+          <w:hyperlink w:anchor="_Toc185187714" w:history="1">
+            <w:r>
+              <w:rPr>
+                <w:rStyle w:val="Hyperlink"/>
+                <w:noProof/>
+              </w:rPr>
+              <w:t>Home.vue</w:t>
+            </w:r>
+            <w:r>
+              <w:rPr>
+                <w:noProof/>
+                <w:webHidden/>
+              </w:rPr>
+              <w:tab/>
+            </w:r>
+            <w:r>
+              <w:rPr>
+                <w:noProof/>
+                <w:webHidden/>
+              </w:rPr>
+              <w:fldChar w:fldCharType="begin"/>
+            </w:r>
+            <w:r>
+              <w:rPr>
+                <w:noProof/>
+                <w:webHidden/>
+              </w:rPr>
+              <w:instrText xml:space="preserve"> PAGEREF _Toc185187714 \h </w:instrText>
+            </w:r>
+            <w:r>
+              <w:rPr>
+                <w:noProof/>
+                <w:webHidden/>
+              </w:rPr>
+            </w:r>
+            <w:r>
+              <w:rPr>
+                <w:noProof/>
+                <w:webHidden/>
+              </w:rPr>
+              <w:fldChar w:fldCharType="separate"/>
+            </w:r>
+            <w:r>
+              <w:rPr>
+                <w:noProof/>
+                <w:webHidden/>
+              </w:rPr>
+              <w:t>3</w:t>
+            </w:r>
+            <w:r>
+              <w:rPr>
+                <w:noProof/>
+                <w:webHidden/>
+              </w:rPr>
+              <w:fldChar w:fldCharType="end"/>
+            </w:r>
+          </w:hyperlink>
+        </w:p>
+        <w:p>
+          <w:pPr>
+            <w:pStyle w:val="Verzeichnis3"/>
+            <w:tabs>
+              <w:tab w:val="right" w:leader="dot" w:pos="9062"/>
+            </w:tabs>
+            <w:rPr>
+              <w:rFonts w:eastAsiaTheme="minorEastAsia"/>
+              <w:noProof/>
+              <w:sz w:val="24"/>
+              <w:szCs w:val="24"/>
+              <w:lang w:eastAsia="de-AT"/>
+            </w:rPr>
+          </w:pPr>
+          <w:hyperlink w:anchor="_Toc185187715" w:history="1">
+            <w:r>
+              <w:rPr>
+                <w:rStyle w:val="Hyperlink"/>
+                <w:noProof/>
+              </w:rPr>
+              <w:t>BookSearch.vue</w:t>
+            </w:r>
+            <w:r>
+              <w:rPr>
+                <w:noProof/>
+                <w:webHidden/>
+              </w:rPr>
+              <w:tab/>
+            </w:r>
+            <w:r>
+              <w:rPr>
+                <w:noProof/>
+                <w:webHidden/>
+              </w:rPr>
+              <w:fldChar w:fldCharType="begin"/>
+            </w:r>
+            <w:r>
+              <w:rPr>
+                <w:noProof/>
+                <w:webHidden/>
+              </w:rPr>
+              <w:instrText xml:space="preserve"> PAGEREF _Toc185187715 \h </w:instrText>
+            </w:r>
+            <w:r>
+              <w:rPr>
+                <w:noProof/>
+                <w:webHidden/>
+              </w:rPr>
+            </w:r>
+            <w:r>
+              <w:rPr>
+                <w:noProof/>
+                <w:webHidden/>
+              </w:rPr>
+              <w:fldChar w:fldCharType="separate"/>
+            </w:r>
+            <w:r>
+              <w:rPr>
+                <w:noProof/>
+                <w:webHidden/>
+              </w:rPr>
+              <w:t>5</w:t>
+            </w:r>
+            <w:r>
+              <w:rPr>
+                <w:noProof/>
+                <w:webHidden/>
+              </w:rPr>
+              <w:fldChar w:fldCharType="end"/>
+            </w:r>
+          </w:hyperlink>
+        </w:p>
+        <w:p>
+          <w:pPr>
+            <w:pStyle w:val="Verzeichnis3"/>
+            <w:tabs>
+              <w:tab w:val="right" w:leader="dot" w:pos="9062"/>
+            </w:tabs>
+            <w:rPr>
+              <w:rFonts w:eastAsiaTheme="minorEastAsia"/>
+              <w:noProof/>
+              <w:sz w:val="24"/>
+              <w:szCs w:val="24"/>
+              <w:lang w:eastAsia="de-AT"/>
+            </w:rPr>
+          </w:pPr>
+          <w:hyperlink w:anchor="_Toc185187716" w:history="1">
+            <w:r>
+              <w:rPr>
+                <w:rStyle w:val="Hyperlink"/>
+                <w:noProof/>
+              </w:rPr>
+              <w:t>BookCard.vue</w:t>
+            </w:r>
+            <w:r>
+              <w:rPr>
+                <w:noProof/>
+                <w:webHidden/>
+              </w:rPr>
+              <w:tab/>
+            </w:r>
+            <w:r>
+              <w:rPr>
+                <w:noProof/>
+                <w:webHidden/>
+              </w:rPr>
+              <w:fldChar w:fldCharType="begin"/>
+            </w:r>
+            <w:r>
+              <w:rPr>
+                <w:noProof/>
+                <w:webHidden/>
+              </w:rPr>
+              <w:instrText xml:space="preserve"> PAGEREF _Toc185187716 \h </w:instrText>
+            </w:r>
+            <w:r>
+              <w:rPr>
+                <w:noProof/>
+                <w:webHidden/>
+              </w:rPr>
+            </w:r>
+            <w:r>
+              <w:rPr>
+                <w:noProof/>
+                <w:webHidden/>
+              </w:rPr>
+              <w:fldChar w:fldCharType="separate"/>
+            </w:r>
+            <w:r>
+              <w:rPr>
+                <w:noProof/>
+                <w:webHidden/>
+              </w:rPr>
+              <w:t>6</w:t>
             </w:r>
             <w:r>
               <w:rPr>
@@ -301,22 +661,73 @@
       <w:r>
         <w:br w:type="page"/>
       </w:r>
-      <w:bookmarkStart w:id="0" w:name="_Toc185186641"/>
+    </w:p>
+    <w:p>
+      <w:pPr>
+        <w:pStyle w:val="berschrift1"/>
+      </w:pPr>
+      <w:bookmarkStart w:id="0" w:name="_Toc184585758"/>
+      <w:bookmarkStart w:id="1" w:name="_Toc185187709"/>
       <w:r>
         <w:lastRenderedPageBreak/>
+        <w:t>Vorwort</w:t>
+      </w:r>
+      <w:bookmarkEnd w:id="0"/>
+      <w:bookmarkEnd w:id="1"/>
+    </w:p>
+    <w:p>
+      <w:r>
+        <w:t>Der Code als Z</w:t>
+      </w:r>
+      <w:r>
+        <w:t xml:space="preserve">IP-Datei ist zu groß für die </w:t>
+      </w:r>
+      <w:proofErr w:type="spellStart"/>
+      <w:r>
+        <w:t>Eduvidual</w:t>
+      </w:r>
+      <w:proofErr w:type="spellEnd"/>
+      <w:r>
+        <w:t>-Abgabe, aber das Projekt ist auf GitHub aufrufbar unter folgendem Link:</w:t>
+      </w:r>
+    </w:p>
+    <w:p>
+      <w:hyperlink r:id="rId8" w:history="1">
+        <w:r>
+          <w:rPr>
+            <w:rStyle w:val="Hyperlink"/>
+          </w:rPr>
+          <w:t>https://github.com/Jodschi/4IT-Webprojekt_Bibliothek</w:t>
+        </w:r>
+      </w:hyperlink>
+    </w:p>
+    <w:p>
+      <w:r>
+        <w:t>In diesem Repository befindet s</w:t>
+      </w:r>
+      <w:r>
+        <w:t>ich sowohl der code als auch die Dokumente und Zwischenstände</w:t>
+      </w:r>
+    </w:p>
+    <w:p>
+      <w:pPr>
+        <w:pStyle w:val="berschrift1"/>
+      </w:pPr>
+      <w:bookmarkStart w:id="2" w:name="_Toc185187710"/>
+      <w:r>
         <w:t>Startseite</w:t>
       </w:r>
-      <w:bookmarkEnd w:id="0"/>
+      <w:bookmarkEnd w:id="2"/>
     </w:p>
     <w:p>
       <w:pPr>
         <w:pStyle w:val="berschrift2"/>
       </w:pPr>
-      <w:bookmarkStart w:id="1" w:name="_Toc185186642"/>
+      <w:bookmarkStart w:id="3" w:name="_Toc185187711"/>
       <w:r>
         <w:t>Suchfunktion</w:t>
       </w:r>
-      <w:bookmarkEnd w:id="1"/>
+      <w:bookmarkEnd w:id="3"/>
     </w:p>
     <w:p>
       <w:r>
@@ -341,7 +752,7 @@
                     <pic:cNvPicPr/>
                   </pic:nvPicPr>
                   <pic:blipFill>
-                    <a:blip r:embed="rId8"/>
+                    <a:blip r:embed="rId9"/>
                     <a:stretch>
                       <a:fillRect/>
                     </a:stretch>
@@ -364,7 +775,23 @@
     </w:p>
     <w:p>
       <w:r>
-        <w:t xml:space="preserve">Die Suche erfolgt durch eine GET-Request mit einem Suchstring in der URL. Durch InertiaJS kann die Ausgabe dynamisch ohne neuladen des Fensters stattfinden. </w:t>
+        <w:t xml:space="preserve">Die Suche erfolgt durch eine GET-Request mit einem Suchstring in der URL. Durch </w:t>
+      </w:r>
+      <w:proofErr w:type="spellStart"/>
+      <w:r>
+        <w:t>InertiaJS</w:t>
+      </w:r>
+      <w:proofErr w:type="spellEnd"/>
+      <w:r>
+        <w:t xml:space="preserve"> kann die Ausgabe dynamisch ohne </w:t>
+      </w:r>
+      <w:proofErr w:type="spellStart"/>
+      <w:r>
+        <w:t>neuladen</w:t>
+      </w:r>
+      <w:proofErr w:type="spellEnd"/>
+      <w:r>
+        <w:t xml:space="preserve"> des Fensters stattfinden. </w:t>
       </w:r>
     </w:p>
     <w:p>
@@ -385,7 +812,7 @@
                     <pic:cNvPicPr/>
                   </pic:nvPicPr>
                   <pic:blipFill>
-                    <a:blip r:embed="rId9"/>
+                    <a:blip r:embed="rId10"/>
                     <a:stretch>
                       <a:fillRect/>
                     </a:stretch>
@@ -425,7 +852,7 @@
                     <pic:cNvPicPr/>
                   </pic:nvPicPr>
                   <pic:blipFill>
-                    <a:blip r:embed="rId10"/>
+                    <a:blip r:embed="rId11"/>
                     <a:stretch>
                       <a:fillRect/>
                     </a:stretch>
@@ -448,35 +875,26 @@
     </w:p>
     <w:p>
       <w:pPr>
-        <w:rPr>
-          <w:rFonts w:asciiTheme="majorHAnsi" w:eastAsiaTheme="majorEastAsia" w:hAnsiTheme="majorHAnsi" w:cstheme="majorBidi"/>
-          <w:color w:val="0F4761" w:themeColor="accent1" w:themeShade="BF"/>
-          <w:sz w:val="36"/>
-          <w:szCs w:val="32"/>
-        </w:rPr>
-      </w:pPr>
-      <w:bookmarkStart w:id="2" w:name="_Toc185186643"/>
-      <w:r>
-        <w:br w:type="page"/>
-      </w:r>
-    </w:p>
-    <w:p>
-      <w:pPr>
         <w:pStyle w:val="berschrift2"/>
       </w:pPr>
+      <w:bookmarkStart w:id="4" w:name="_Toc185187712"/>
       <w:r>
         <w:lastRenderedPageBreak/>
         <w:t>Code</w:t>
       </w:r>
-      <w:bookmarkEnd w:id="2"/>
+      <w:bookmarkEnd w:id="4"/>
     </w:p>
     <w:p>
       <w:pPr>
         <w:pStyle w:val="berschrift3"/>
       </w:pPr>
+      <w:bookmarkStart w:id="5" w:name="_Toc185187713"/>
+      <w:proofErr w:type="spellStart"/>
       <w:r>
         <w:t>GuestController.php</w:t>
       </w:r>
+      <w:bookmarkEnd w:id="5"/>
+      <w:proofErr w:type="spellEnd"/>
     </w:p>
     <w:p>
       <w:r>
@@ -496,7 +914,7 @@
                     <pic:cNvPicPr/>
                   </pic:nvPicPr>
                   <pic:blipFill>
-                    <a:blip r:embed="rId11"/>
+                    <a:blip r:embed="rId12"/>
                     <a:stretch>
                       <a:fillRect/>
                     </a:stretch>
@@ -535,7 +953,7 @@
                     <pic:cNvPicPr/>
                   </pic:nvPicPr>
                   <pic:blipFill>
-                    <a:blip r:embed="rId12"/>
+                    <a:blip r:embed="rId13"/>
                     <a:stretch>
                       <a:fillRect/>
                     </a:stretch>
@@ -560,9 +978,13 @@
       <w:pPr>
         <w:pStyle w:val="berschrift3"/>
       </w:pPr>
+      <w:bookmarkStart w:id="6" w:name="_Toc185187714"/>
+      <w:proofErr w:type="spellStart"/>
       <w:r>
         <w:t>Home.vue</w:t>
       </w:r>
+      <w:bookmarkEnd w:id="6"/>
+      <w:proofErr w:type="spellEnd"/>
     </w:p>
     <w:p>
       <w:r>
@@ -582,7 +1004,7 @@
                     <pic:cNvPicPr/>
                   </pic:nvPicPr>
                   <pic:blipFill rotWithShape="1">
-                    <a:blip r:embed="rId13"/>
+                    <a:blip r:embed="rId14"/>
                     <a:srcRect b="16974"/>
                     <a:stretch/>
                   </pic:blipFill>
@@ -656,7 +1078,7 @@
                     <pic:cNvPicPr/>
                   </pic:nvPicPr>
                   <pic:blipFill>
-                    <a:blip r:embed="rId14"/>
+                    <a:blip r:embed="rId15"/>
                     <a:stretch>
                       <a:fillRect/>
                     </a:stretch>
@@ -681,7 +1103,49 @@
           <w:rStyle w:val="SchwacheHervorhebung"/>
         </w:rPr>
         <w:br/>
-        <w:t>Page Props, um auf die Daten aus dem Laravel Backend zugreifen zu können.</w:t>
+        <w:t xml:space="preserve">Page </w:t>
+      </w:r>
+      <w:proofErr w:type="spellStart"/>
+      <w:r>
+        <w:rPr>
+          <w:rStyle w:val="SchwacheHervorhebung"/>
+        </w:rPr>
+        <w:t>Props</w:t>
+      </w:r>
+      <w:proofErr w:type="spellEnd"/>
+      <w:r>
+        <w:rPr>
+          <w:rStyle w:val="SchwacheHervorhebung"/>
+        </w:rPr>
+        <w:t xml:space="preserve">, um auf die Daten aus dem </w:t>
+      </w:r>
+      <w:proofErr w:type="spellStart"/>
+      <w:r>
+        <w:rPr>
+          <w:rStyle w:val="SchwacheHervorhebung"/>
+        </w:rPr>
+        <w:t>Laravel</w:t>
+      </w:r>
+      <w:proofErr w:type="spellEnd"/>
+      <w:r>
+        <w:rPr>
+          <w:rStyle w:val="SchwacheHervorhebung"/>
+        </w:rPr>
+        <w:t xml:space="preserve"> </w:t>
+      </w:r>
+      <w:proofErr w:type="gramStart"/>
+      <w:r>
+        <w:rPr>
+          <w:rStyle w:val="SchwacheHervorhebung"/>
+        </w:rPr>
+        <w:t>Backend</w:t>
+      </w:r>
+      <w:proofErr w:type="gramEnd"/>
+      <w:r>
+        <w:rPr>
+          <w:rStyle w:val="SchwacheHervorhebung"/>
+        </w:rPr>
+        <w:t xml:space="preserve"> zugreifen zu können.</w:t>
       </w:r>
     </w:p>
     <w:p>
@@ -717,7 +1181,7 @@
                     <pic:cNvPicPr/>
                   </pic:nvPicPr>
                   <pic:blipFill>
-                    <a:blip r:embed="rId15"/>
+                    <a:blip r:embed="rId16"/>
                     <a:stretch>
                       <a:fillRect/>
                     </a:stretch>
@@ -742,7 +1206,21 @@
           <w:rStyle w:val="SchwacheHervorhebung"/>
         </w:rPr>
         <w:br/>
-        <w:t>Funktion, um die Bücher dynamisch abzufragen. Wird beim ersten Render der Komponente einmal ausgeführt und danach, wenn sich der Suchstring ändert.</w:t>
+        <w:t xml:space="preserve">Funktion, um die Bücher dynamisch abzufragen. Wird beim ersten </w:t>
+      </w:r>
+      <w:proofErr w:type="spellStart"/>
+      <w:r>
+        <w:rPr>
+          <w:rStyle w:val="SchwacheHervorhebung"/>
+        </w:rPr>
+        <w:t>Render</w:t>
+      </w:r>
+      <w:proofErr w:type="spellEnd"/>
+      <w:r>
+        <w:rPr>
+          <w:rStyle w:val="SchwacheHervorhebung"/>
+        </w:rPr>
+        <w:t xml:space="preserve"> der Komponente einmal ausgeführt und danach, wenn sich der Suchstring ändert.</w:t>
       </w:r>
     </w:p>
     <w:p>
@@ -778,7 +1256,7 @@
                     <pic:cNvPicPr/>
                   </pic:nvPicPr>
                   <pic:blipFill>
-                    <a:blip r:embed="rId16"/>
+                    <a:blip r:embed="rId17"/>
                     <a:stretch>
                       <a:fillRect/>
                     </a:stretch>
@@ -840,7 +1318,7 @@
                     <pic:cNvPicPr/>
                   </pic:nvPicPr>
                   <pic:blipFill>
-                    <a:blip r:embed="rId17"/>
+                    <a:blip r:embed="rId18"/>
                     <a:stretch>
                       <a:fillRect/>
                     </a:stretch>
@@ -865,7 +1343,21 @@
           <w:rStyle w:val="SchwacheHervorhebung"/>
         </w:rPr>
         <w:br/>
-        <w:t>HTML der Seite. Für jedes Buch-Objekt wird eine BookCard – Komponente angezeigt.</w:t>
+        <w:t xml:space="preserve">HTML der Seite. Für jedes Buch-Objekt wird eine </w:t>
+      </w:r>
+      <w:proofErr w:type="spellStart"/>
+      <w:r>
+        <w:rPr>
+          <w:rStyle w:val="SchwacheHervorhebung"/>
+        </w:rPr>
+        <w:t>BookCard</w:t>
+      </w:r>
+      <w:proofErr w:type="spellEnd"/>
+      <w:r>
+        <w:rPr>
+          <w:rStyle w:val="SchwacheHervorhebung"/>
+        </w:rPr>
+        <w:t xml:space="preserve"> – Komponente angezeigt.</w:t>
       </w:r>
     </w:p>
     <w:p>
@@ -879,9 +1371,13 @@
       <w:pPr>
         <w:pStyle w:val="berschrift3"/>
       </w:pPr>
+      <w:bookmarkStart w:id="7" w:name="_Toc185187715"/>
+      <w:proofErr w:type="spellStart"/>
       <w:r>
         <w:t>BookSearch.vue</w:t>
       </w:r>
+      <w:bookmarkEnd w:id="7"/>
+      <w:proofErr w:type="spellEnd"/>
     </w:p>
     <w:p>
       <w:r>
@@ -901,7 +1397,7 @@
                     <pic:cNvPicPr/>
                   </pic:nvPicPr>
                   <pic:blipFill>
-                    <a:blip r:embed="rId18"/>
+                    <a:blip r:embed="rId19"/>
                     <a:stretch>
                       <a:fillRect/>
                     </a:stretch>
@@ -932,8 +1428,37 @@
         <w:rPr>
           <w:rStyle w:val="SchwacheHervorhebung"/>
         </w:rPr>
-        <w:t xml:space="preserve">Komponente für die Suchfunktion. Im Grunde nur ein gestylter „input type=text“ Tag. Das input-Event wird mit </w:t>
-      </w:r>
+        <w:t>Komponente für die Suchfunktion. Im Grunde nur ein gestylter „</w:t>
+      </w:r>
+      <w:proofErr w:type="spellStart"/>
+      <w:r>
+        <w:rPr>
+          <w:rStyle w:val="SchwacheHervorhebung"/>
+        </w:rPr>
+        <w:t>input</w:t>
+      </w:r>
+      <w:proofErr w:type="spellEnd"/>
+      <w:r>
+        <w:rPr>
+          <w:rStyle w:val="SchwacheHervorhebung"/>
+        </w:rPr>
+        <w:t xml:space="preserve"> type=</w:t>
+      </w:r>
+      <w:proofErr w:type="spellStart"/>
+      <w:r>
+        <w:rPr>
+          <w:rStyle w:val="SchwacheHervorhebung"/>
+        </w:rPr>
+        <w:t>text</w:t>
+      </w:r>
+      <w:proofErr w:type="spellEnd"/>
+      <w:r>
+        <w:rPr>
+          <w:rStyle w:val="SchwacheHervorhebung"/>
+        </w:rPr>
+        <w:t xml:space="preserve">“ Tag. Das input-Event wird mit </w:t>
+      </w:r>
+      <w:proofErr w:type="spellStart"/>
       <w:r>
         <w:rPr>
           <w:rStyle w:val="SchwacheHervorhebung"/>
@@ -941,6 +1466,7 @@
         </w:rPr>
         <w:t>emit</w:t>
       </w:r>
+      <w:proofErr w:type="spellEnd"/>
       <w:r>
         <w:rPr>
           <w:rStyle w:val="SchwacheHervorhebung"/>
@@ -966,10 +1492,14 @@
       <w:pPr>
         <w:pStyle w:val="berschrift3"/>
       </w:pPr>
+      <w:bookmarkStart w:id="8" w:name="_Toc185187716"/>
+      <w:proofErr w:type="spellStart"/>
       <w:r>
         <w:lastRenderedPageBreak/>
         <w:t>BookCard.vue</w:t>
       </w:r>
+      <w:bookmarkEnd w:id="8"/>
+      <w:proofErr w:type="spellEnd"/>
     </w:p>
     <w:p>
       <w:r>
@@ -989,7 +1519,7 @@
                     <pic:cNvPicPr/>
                   </pic:nvPicPr>
                   <pic:blipFill rotWithShape="1">
-                    <a:blip r:embed="rId19"/>
+                    <a:blip r:embed="rId20"/>
                     <a:srcRect l="919" t="-3" r="1423" b="3"/>
                     <a:stretch/>
                   </pic:blipFill>
@@ -1033,7 +1563,7 @@
                     <pic:cNvPicPr/>
                   </pic:nvPicPr>
                   <pic:blipFill>
-                    <a:blip r:embed="rId20"/>
+                    <a:blip r:embed="rId21"/>
                     <a:stretch>
                       <a:fillRect/>
                     </a:stretch>
@@ -1070,7 +1600,7 @@
                     <pic:cNvPicPr/>
                   </pic:nvPicPr>
                   <pic:blipFill rotWithShape="1">
-                    <a:blip r:embed="rId21"/>
+                    <a:blip r:embed="rId22"/>
                     <a:srcRect l="640" r="305"/>
                     <a:stretch/>
                   </pic:blipFill>
@@ -1099,7 +1629,7 @@
       </w:r>
     </w:p>
     <w:sectPr>
-      <w:headerReference w:type="default" r:id="rId22"/>
+      <w:headerReference w:type="default" r:id="rId23"/>
       <w:pgSz w:w="11906" w:h="16838"/>
       <w:pgMar w:top="1417" w:right="1417" w:bottom="1134" w:left="1417" w:header="708" w:footer="708" w:gutter="0"/>
       <w:cols w:space="708"/>

</xml_diff>